<commit_message>
Fix list formatting and recompile resumes to PDF and DOCX
</commit_message>
<xml_diff>
--- a/portfolio/documents/resume/mragsdale-resume.docx
+++ b/portfolio/documents/resume/mragsdale-resume.docx
@@ -531,227 +531,6 @@
         </w:rPr>
         <w:t xml:space="preserve">City of Virginia Beach Parks &amp; Recreation | Virginia Beach, VA | May 2023 – Present</w:t>
       </w:r>
-      <w:r>
-        <w:t xml:space="preserve"> </w:t>
-      </w:r>
-      <w:r>
-        <w:t xml:space="preserve">*</w:t>
-      </w:r>
-      <w:r>
-        <w:t xml:space="preserve"> </w:t>
-      </w:r>
-      <w:r>
-        <w:rPr>
-          <w:b/>
-          <w:bCs/>
-        </w:rPr>
-        <w:t xml:space="preserve">Data Engineering &amp; ETL Pipelines:</w:t>
-      </w:r>
-      <w:r>
-        <w:t xml:space="preserve"> </w:t>
-      </w:r>
-      <w:r>
-        <w:t xml:space="preserve">Architect and manage manual ETL (Extract-Transform-Load) pipelines to ingest, normalize, and secure complex operational and financial data from legacy enterprise platforms (ActiveNet) into highly accessible digital formats.</w:t>
-      </w:r>
-      <w:r>
-        <w:t xml:space="preserve"> </w:t>
-      </w:r>
-      <w:r>
-        <w:t xml:space="preserve">*</w:t>
-      </w:r>
-      <w:r>
-        <w:t xml:space="preserve"> </w:t>
-      </w:r>
-      <w:r>
-        <w:rPr>
-          <w:b/>
-          <w:bCs/>
-        </w:rPr>
-        <w:t xml:space="preserve">Player-Coach Leadership &amp; Training:</w:t>
-      </w:r>
-      <w:r>
-        <w:t xml:space="preserve"> </w:t>
-      </w:r>
-      <w:r>
-        <w:t xml:space="preserve">Serve as the primary technical trainer and operational escalation point for municipal staff, translating complex data integrity protocols and Revenue Cycle Management (RCM) compliance into actionable training programs.</w:t>
-      </w:r>
-      <w:r>
-        <w:t xml:space="preserve"> </w:t>
-      </w:r>
-      <w:r>
-        <w:t xml:space="preserve">*</w:t>
-      </w:r>
-      <w:r>
-        <w:t xml:space="preserve"> </w:t>
-      </w:r>
-      <w:r>
-        <w:rPr>
-          <w:b/>
-          <w:bCs/>
-        </w:rPr>
-        <w:t xml:space="preserve">Stakeholder &amp; Governance Management:</w:t>
-      </w:r>
-      <w:r>
-        <w:t xml:space="preserve"> </w:t>
-      </w:r>
-      <w:r>
-        <w:t xml:space="preserve">Partner with facility leadership to optimize resource allocation, resolving complex logistical conflicts through data-driven insights and strict adherence to municipal policy.</w:t>
-      </w:r>
-      <w:r>
-        <w:t xml:space="preserve"> </w:t>
-      </w:r>
-      <w:r>
-        <w:t xml:space="preserve">*</w:t>
-      </w:r>
-      <w:r>
-        <w:t xml:space="preserve"> </w:t>
-      </w:r>
-      <w:r>
-        <w:rPr>
-          <w:b/>
-          <w:bCs/>
-        </w:rPr>
-        <w:t xml:space="preserve">Compliance Enforcement:</w:t>
-      </w:r>
-      <w:r>
-        <w:t xml:space="preserve"> </w:t>
-      </w:r>
-      <w:r>
-        <w:t xml:space="preserve">Govern output data to guarantee strict Section 508 compliance across all generated operational documents from legacy systems, ensuring institutional adherence to federal accessibility mandates.</w:t>
-      </w:r>
-    </w:p>
-    <w:bookmarkEnd w:id="13"/>
-    <w:bookmarkStart w:id="14" w:name="_6e602a99d4c41c1981e2abdc8e2e79ae14007a3"/>
-    <w:p>
-      <w:pPr>
-        <w:pStyle w:val="Heading3"/>
-      </w:pPr>
-      <w:r>
-        <w:t xml:space="preserve">Computer Operations</w:t>
-      </w:r>
-    </w:p>
-    <w:p>
-      <w:pPr>
-        <w:pStyle w:val="FirstParagraph"/>
-      </w:pPr>
-      <w:r>
-        <w:rPr>
-          <w:b/>
-          <w:bCs/>
-        </w:rPr>
-        <w:t xml:space="preserve">Old Dominion University (ODU Online) | Norfolk, VA | Nov 2019 – Jul 2022</w:t>
-      </w:r>
-      <w:r>
-        <w:t xml:space="preserve"> </w:t>
-      </w:r>
-      <w:r>
-        <w:t xml:space="preserve">*</w:t>
-      </w:r>
-      <w:r>
-        <w:t xml:space="preserve"> </w:t>
-      </w:r>
-      <w:r>
-        <w:rPr>
-          <w:b/>
-          <w:bCs/>
-        </w:rPr>
-        <w:t xml:space="preserve">Enterprise Accessibility Strategy:</w:t>
-      </w:r>
-      <w:r>
-        <w:t xml:space="preserve"> </w:t>
-      </w:r>
-      <w:r>
-        <w:t xml:space="preserve">Served as the primary technical gatekeeper for enterprise-level data and web content during a massive, university-wide digital infrastructure migration to the Canvas LMS.</w:t>
-      </w:r>
-      <w:r>
-        <w:t xml:space="preserve"> </w:t>
-      </w:r>
-      <w:r>
-        <w:t xml:space="preserve">*</w:t>
-      </w:r>
-      <w:r>
-        <w:t xml:space="preserve"> </w:t>
-      </w:r>
-      <w:r>
-        <w:rPr>
-          <w:b/>
-          <w:bCs/>
-        </w:rPr>
-        <w:t xml:space="preserve">Compliance Auditing:</w:t>
-      </w:r>
-      <w:r>
-        <w:t xml:space="preserve"> </w:t>
-      </w:r>
-      <w:r>
-        <w:t xml:space="preserve">Executed rigorous WCAG 2.1 AA and Section 508 compliance audits, remediating complex codebases (HTML/CSS) and ensuring strict structural integrity across institutional platforms using tools like Deque axe.</w:t>
-      </w:r>
-      <w:r>
-        <w:t xml:space="preserve"> </w:t>
-      </w:r>
-      <w:r>
-        <w:t xml:space="preserve">*</w:t>
-      </w:r>
-      <w:r>
-        <w:t xml:space="preserve"> </w:t>
-      </w:r>
-      <w:r>
-        <w:rPr>
-          <w:b/>
-          <w:bCs/>
-        </w:rPr>
-        <w:t xml:space="preserve">Architectural Standardization:</w:t>
-      </w:r>
-      <w:r>
-        <w:t xml:space="preserve"> </w:t>
-      </w:r>
-      <w:r>
-        <w:t xml:space="preserve">Engineered universal, inherently accessible data/architectural templates deployed across the university ecosystem, heavily streamlining data-entry workflows for instructional design faculty.</w:t>
-      </w:r>
-    </w:p>
-    <w:bookmarkEnd w:id="14"/>
-    <w:bookmarkStart w:id="15" w:name="_a2958cbc8ef5ad36a965cbeb8b3a440a5ca665e"/>
-    <w:p>
-      <w:pPr>
-        <w:pStyle w:val="Heading3"/>
-      </w:pPr>
-      <w:r>
-        <w:t xml:space="preserve">Mobile Applications Developer Intern</w:t>
-      </w:r>
-    </w:p>
-    <w:p>
-      <w:pPr>
-        <w:pStyle w:val="FirstParagraph"/>
-      </w:pPr>
-      <w:r>
-        <w:rPr>
-          <w:b/>
-          <w:bCs/>
-        </w:rPr>
-        <w:t xml:space="preserve">Dominion Enterprises | Norfolk, VA | Sep 2012 – Dec 2012</w:t>
-      </w:r>
-      <w:r>
-        <w:t xml:space="preserve"> </w:t>
-      </w:r>
-      <w:r>
-        <w:t xml:space="preserve">* Engineered cross-platform mobile applications for iOS and Android utilizing the JavaScript-based Titanium SDK.</w:t>
-      </w:r>
-      <w:r>
-        <w:t xml:space="preserve"> </w:t>
-      </w:r>
-      <w:r>
-        <w:t xml:space="preserve">* Gained foundational, hands-on experience in mobile architecture and deployment, establishing a decade-long trajectory in software engineering.</w:t>
-      </w:r>
-    </w:p>
-    <w:bookmarkEnd w:id="15"/>
-    <w:bookmarkEnd w:id="16"/>
-    <w:bookmarkStart w:id="17" w:name="_e51e59133c19091a8a6bacd7e5e92ac9fbc5be1"/>
-    <w:p>
-      <w:pPr>
-        <w:pStyle w:val="Heading2"/>
-      </w:pPr>
-      <w:r>
-        <w:t xml:space="preserve">Education &amp; Certification</w:t>
-      </w:r>
     </w:p>
     <w:p>
       <w:pPr>
@@ -766,13 +545,13 @@
           <w:b/>
           <w:bCs/>
         </w:rPr>
-        <w:t xml:space="preserve">Tidewater Community College | Virginia Beach, VA</w:t>
-      </w:r>
-      <w:r>
-        <w:t xml:space="preserve"> </w:t>
-      </w:r>
-      <w:r>
-        <w:t xml:space="preserve">Associate of Science, Information Technology (Focus: Software Engineering &amp; Web Dev) | Expected Dec 2027</w:t>
+        <w:t xml:space="preserve">Data Engineering &amp; ETL Pipelines:</w:t>
+      </w:r>
+      <w:r>
+        <w:t xml:space="preserve"> </w:t>
+      </w:r>
+      <w:r>
+        <w:t xml:space="preserve">Architect and manage manual ETL (Extract-Transform-Load) pipelines to ingest, normalize, and secure complex operational and financial data from legacy enterprise platforms (ActiveNet) into highly accessible digital formats.</w:t>
       </w:r>
     </w:p>
     <w:p>
@@ -788,13 +567,13 @@
           <w:b/>
           <w:bCs/>
         </w:rPr>
-        <w:t xml:space="preserve">Old Dominion University | Norfolk, VA</w:t>
-      </w:r>
-      <w:r>
-        <w:t xml:space="preserve"> </w:t>
-      </w:r>
-      <w:r>
-        <w:t xml:space="preserve">Bachelor of Science, Customized Studies in Leadership | Prior Coursework</w:t>
+        <w:t xml:space="preserve">Player-Coach Leadership &amp; Training:</w:t>
+      </w:r>
+      <w:r>
+        <w:t xml:space="preserve"> </w:t>
+      </w:r>
+      <w:r>
+        <w:t xml:space="preserve">Serve as the primary technical trainer and operational escalation point for municipal staff, translating complex data integrity protocols and Revenue Cycle Management (RCM) compliance into actionable training programs.</w:t>
       </w:r>
     </w:p>
     <w:p>
@@ -803,6 +582,239 @@
         <w:numPr>
           <w:ilvl w:val="0"/>
           <w:numId w:val="1003"/>
+        </w:numPr>
+      </w:pPr>
+      <w:r>
+        <w:rPr>
+          <w:b/>
+          <w:bCs/>
+        </w:rPr>
+        <w:t xml:space="preserve">Stakeholder &amp; Governance Management:</w:t>
+      </w:r>
+      <w:r>
+        <w:t xml:space="preserve"> </w:t>
+      </w:r>
+      <w:r>
+        <w:t xml:space="preserve">Partner with facility leadership to optimize resource allocation, resolving complex logistical conflicts through data-driven insights and strict adherence to municipal policy.</w:t>
+      </w:r>
+    </w:p>
+    <w:p>
+      <w:pPr>
+        <w:pStyle w:val="Compact"/>
+        <w:numPr>
+          <w:ilvl w:val="0"/>
+          <w:numId w:val="1003"/>
+        </w:numPr>
+      </w:pPr>
+      <w:r>
+        <w:rPr>
+          <w:b/>
+          <w:bCs/>
+        </w:rPr>
+        <w:t xml:space="preserve">Compliance Enforcement:</w:t>
+      </w:r>
+      <w:r>
+        <w:t xml:space="preserve"> </w:t>
+      </w:r>
+      <w:r>
+        <w:t xml:space="preserve">Govern output data to guarantee strict Section 508 compliance across all generated operational documents from legacy systems, ensuring institutional adherence to federal accessibility mandates.</w:t>
+      </w:r>
+    </w:p>
+    <w:bookmarkEnd w:id="13"/>
+    <w:bookmarkStart w:id="14" w:name="_6e602a99d4c41c1981e2abdc8e2e79ae14007a3"/>
+    <w:p>
+      <w:pPr>
+        <w:pStyle w:val="Heading3"/>
+      </w:pPr>
+      <w:r>
+        <w:t xml:space="preserve">Computer Operations</w:t>
+      </w:r>
+    </w:p>
+    <w:p>
+      <w:pPr>
+        <w:pStyle w:val="FirstParagraph"/>
+      </w:pPr>
+      <w:r>
+        <w:rPr>
+          <w:b/>
+          <w:bCs/>
+        </w:rPr>
+        <w:t xml:space="preserve">Old Dominion University (ODU Online) | Norfolk, VA | Nov 2019 – Jul 2022</w:t>
+      </w:r>
+    </w:p>
+    <w:p>
+      <w:pPr>
+        <w:pStyle w:val="Compact"/>
+        <w:numPr>
+          <w:ilvl w:val="0"/>
+          <w:numId w:val="1004"/>
+        </w:numPr>
+      </w:pPr>
+      <w:r>
+        <w:rPr>
+          <w:b/>
+          <w:bCs/>
+        </w:rPr>
+        <w:t xml:space="preserve">Enterprise Accessibility Strategy:</w:t>
+      </w:r>
+      <w:r>
+        <w:t xml:space="preserve"> </w:t>
+      </w:r>
+      <w:r>
+        <w:t xml:space="preserve">Served as the primary technical gatekeeper for enterprise-level data and web content during a massive, university-wide digital infrastructure migration to the Canvas LMS.</w:t>
+      </w:r>
+    </w:p>
+    <w:p>
+      <w:pPr>
+        <w:pStyle w:val="Compact"/>
+        <w:numPr>
+          <w:ilvl w:val="0"/>
+          <w:numId w:val="1004"/>
+        </w:numPr>
+      </w:pPr>
+      <w:r>
+        <w:rPr>
+          <w:b/>
+          <w:bCs/>
+        </w:rPr>
+        <w:t xml:space="preserve">Compliance Auditing:</w:t>
+      </w:r>
+      <w:r>
+        <w:t xml:space="preserve"> </w:t>
+      </w:r>
+      <w:r>
+        <w:t xml:space="preserve">Executed rigorous WCAG 2.1 AA and Section 508 compliance audits, remediating complex codebases (HTML/CSS) and ensuring strict structural integrity across institutional platforms using tools like Deque axe.</w:t>
+      </w:r>
+    </w:p>
+    <w:p>
+      <w:pPr>
+        <w:pStyle w:val="Compact"/>
+        <w:numPr>
+          <w:ilvl w:val="0"/>
+          <w:numId w:val="1004"/>
+        </w:numPr>
+      </w:pPr>
+      <w:r>
+        <w:rPr>
+          <w:b/>
+          <w:bCs/>
+        </w:rPr>
+        <w:t xml:space="preserve">Architectural Standardization:</w:t>
+      </w:r>
+      <w:r>
+        <w:t xml:space="preserve"> </w:t>
+      </w:r>
+      <w:r>
+        <w:t xml:space="preserve">Engineered universal, inherently accessible data/architectural templates deployed across the university ecosystem, heavily streamlining data-entry workflows for instructional design faculty.</w:t>
+      </w:r>
+    </w:p>
+    <w:bookmarkEnd w:id="14"/>
+    <w:bookmarkStart w:id="15" w:name="_a2958cbc8ef5ad36a965cbeb8b3a440a5ca665e"/>
+    <w:p>
+      <w:pPr>
+        <w:pStyle w:val="Heading3"/>
+      </w:pPr>
+      <w:r>
+        <w:t xml:space="preserve">Mobile Applications Developer Intern</w:t>
+      </w:r>
+    </w:p>
+    <w:p>
+      <w:pPr>
+        <w:pStyle w:val="FirstParagraph"/>
+      </w:pPr>
+      <w:r>
+        <w:rPr>
+          <w:b/>
+          <w:bCs/>
+        </w:rPr>
+        <w:t xml:space="preserve">Dominion Enterprises | Norfolk, VA | Sep 2012 – Dec 2012</w:t>
+      </w:r>
+    </w:p>
+    <w:p>
+      <w:pPr>
+        <w:pStyle w:val="Compact"/>
+        <w:numPr>
+          <w:ilvl w:val="0"/>
+          <w:numId w:val="1005"/>
+        </w:numPr>
+      </w:pPr>
+      <w:r>
+        <w:t xml:space="preserve">Engineered cross-platform mobile applications for iOS and Android utilizing the JavaScript-based Titanium SDK.</w:t>
+      </w:r>
+    </w:p>
+    <w:p>
+      <w:pPr>
+        <w:pStyle w:val="Compact"/>
+        <w:numPr>
+          <w:ilvl w:val="0"/>
+          <w:numId w:val="1005"/>
+        </w:numPr>
+      </w:pPr>
+      <w:r>
+        <w:t xml:space="preserve">Gained foundational, hands-on experience in mobile architecture and deployment, establishing a decade-long trajectory in software engineering.</w:t>
+      </w:r>
+    </w:p>
+    <w:bookmarkEnd w:id="15"/>
+    <w:bookmarkEnd w:id="16"/>
+    <w:bookmarkStart w:id="17" w:name="_e51e59133c19091a8a6bacd7e5e92ac9fbc5be1"/>
+    <w:p>
+      <w:pPr>
+        <w:pStyle w:val="Heading2"/>
+      </w:pPr>
+      <w:r>
+        <w:t xml:space="preserve">Education &amp; Certification</w:t>
+      </w:r>
+    </w:p>
+    <w:p>
+      <w:pPr>
+        <w:pStyle w:val="Compact"/>
+        <w:numPr>
+          <w:ilvl w:val="0"/>
+          <w:numId w:val="1006"/>
+        </w:numPr>
+      </w:pPr>
+      <w:r>
+        <w:rPr>
+          <w:b/>
+          <w:bCs/>
+        </w:rPr>
+        <w:t xml:space="preserve">Tidewater Community College | Virginia Beach, VA</w:t>
+      </w:r>
+      <w:r>
+        <w:t xml:space="preserve"> </w:t>
+      </w:r>
+      <w:r>
+        <w:t xml:space="preserve">Associate of Science, Information Technology (Focus: Software Engineering &amp; Web Dev) | Expected Dec 2027</w:t>
+      </w:r>
+    </w:p>
+    <w:p>
+      <w:pPr>
+        <w:pStyle w:val="Compact"/>
+        <w:numPr>
+          <w:ilvl w:val="0"/>
+          <w:numId w:val="1006"/>
+        </w:numPr>
+      </w:pPr>
+      <w:r>
+        <w:rPr>
+          <w:b/>
+          <w:bCs/>
+        </w:rPr>
+        <w:t xml:space="preserve">Old Dominion University | Norfolk, VA</w:t>
+      </w:r>
+      <w:r>
+        <w:t xml:space="preserve"> </w:t>
+      </w:r>
+      <w:r>
+        <w:t xml:space="preserve">Bachelor of Science, Customized Studies in Leadership | Prior Coursework</w:t>
+      </w:r>
+    </w:p>
+    <w:p>
+      <w:pPr>
+        <w:pStyle w:val="Compact"/>
+        <w:numPr>
+          <w:ilvl w:val="0"/>
+          <w:numId w:val="1006"/>
         </w:numPr>
       </w:pPr>
       <w:r>
@@ -1044,6 +1056,15 @@
     <w:abstractNumId w:val="991"/>
   </w:num>
   <w:num w:numId="1003">
+    <w:abstractNumId w:val="991"/>
+  </w:num>
+  <w:num w:numId="1004">
+    <w:abstractNumId w:val="991"/>
+  </w:num>
+  <w:num w:numId="1005">
+    <w:abstractNumId w:val="991"/>
+  </w:num>
+  <w:num w:numId="1006">
     <w:abstractNumId w:val="991"/>
   </w:num>
 </w:numbering>

</xml_diff>